<commit_message>
Finished multiple merges. Added features.
</commit_message>
<xml_diff>
--- a/project/documents/communications/PctCommRespToInv.docx
+++ b/project/documents/communications/PctCommRespToInv.docx
@@ -582,7 +582,7 @@
           <w:u w:val="single"/>
         </w:rPr>
         <w:pict w14:anchorId="61E7C5D1">
-          <v:line id="_x0000_s2070" style="position:absolute;z-index:251657728" from="303.9pt,9.65pt" to="501.9pt,9.65pt"/>
+          <v:line id="_x0000_s2070" style="position:absolute;z-index:1" from="303.9pt,9.65pt" to="501.9pt,9.65pt"/>
         </w:pict>
       </w:r>
       <w:r>
@@ -704,25 +704,11 @@
     </w:p>
     <w:p>
       <w:pPr>
-        <w:widowControl/>
-        <w:spacing w:line="300" w:lineRule="auto"/>
-        <w:ind w:left="2880" w:hanging="2880"/>
-      </w:pPr>
-    </w:p>
-    <w:p>
-      <w:pPr>
         <w:rPr>
           <w:sz w:val="20"/>
           <w:szCs w:val="20"/>
         </w:rPr>
       </w:pPr>
-      <w:r>
-        <w:rPr>
-          <w:sz w:val="20"/>
-          <w:szCs w:val="20"/>
-        </w:rPr>
-        <w:t>&lt;&lt;USPSDHL&gt;&gt;</w:t>
-      </w:r>
     </w:p>
     <w:p>
       <w:pPr>
@@ -1310,21 +1296,6 @@
           <w:tab w:val="left" w:pos="-1440"/>
         </w:tabs>
       </w:pPr>
-    </w:p>
-    <w:p>
-      <w:pPr>
-        <w:widowControl/>
-        <w:tabs>
-          <w:tab w:val="left" w:pos="-1440"/>
-        </w:tabs>
-      </w:pPr>
-      <w:r>
-        <w:rPr>
-          <w:sz w:val="16"/>
-          <w:szCs w:val="16"/>
-        </w:rPr>
-        <w:t>&lt;&lt;usMailOnly&gt;&gt;</w:t>
-      </w:r>
     </w:p>
     <w:sectPr>
       <w:headerReference w:type="even" r:id="rId8"/>
@@ -1823,6 +1794,50 @@
     <w:lsdException w:name="Subtitle" w:qFormat="1"/>
     <w:lsdException w:name="Strong" w:qFormat="1"/>
     <w:lsdException w:name="Emphasis" w:qFormat="1"/>
+    <w:lsdException w:name="Normal Table" w:semiHidden="1" w:unhideWhenUsed="1"/>
+    <w:lsdException w:name="Table Simple 1" w:semiHidden="1" w:unhideWhenUsed="1"/>
+    <w:lsdException w:name="Table Simple 2" w:semiHidden="1" w:unhideWhenUsed="1"/>
+    <w:lsdException w:name="Table Simple 3" w:semiHidden="1" w:unhideWhenUsed="1"/>
+    <w:lsdException w:name="Table Classic 1" w:semiHidden="1" w:unhideWhenUsed="1"/>
+    <w:lsdException w:name="Table Classic 2" w:semiHidden="1" w:unhideWhenUsed="1"/>
+    <w:lsdException w:name="Table Classic 3" w:semiHidden="1" w:unhideWhenUsed="1"/>
+    <w:lsdException w:name="Table Classic 4" w:semiHidden="1" w:unhideWhenUsed="1"/>
+    <w:lsdException w:name="Table Colorful 1" w:semiHidden="1" w:unhideWhenUsed="1"/>
+    <w:lsdException w:name="Table Colorful 2" w:semiHidden="1" w:unhideWhenUsed="1"/>
+    <w:lsdException w:name="Table Colorful 3" w:semiHidden="1" w:unhideWhenUsed="1"/>
+    <w:lsdException w:name="Table Columns 1" w:semiHidden="1" w:unhideWhenUsed="1"/>
+    <w:lsdException w:name="Table Columns 2" w:semiHidden="1" w:unhideWhenUsed="1"/>
+    <w:lsdException w:name="Table Columns 3" w:semiHidden="1" w:unhideWhenUsed="1"/>
+    <w:lsdException w:name="Table Columns 4" w:semiHidden="1" w:unhideWhenUsed="1"/>
+    <w:lsdException w:name="Table Columns 5" w:semiHidden="1" w:unhideWhenUsed="1"/>
+    <w:lsdException w:name="Table Grid 1" w:semiHidden="1" w:unhideWhenUsed="1"/>
+    <w:lsdException w:name="Table Grid 2" w:semiHidden="1" w:unhideWhenUsed="1"/>
+    <w:lsdException w:name="Table Grid 3" w:semiHidden="1" w:unhideWhenUsed="1"/>
+    <w:lsdException w:name="Table Grid 4" w:semiHidden="1" w:unhideWhenUsed="1"/>
+    <w:lsdException w:name="Table Grid 5" w:semiHidden="1" w:unhideWhenUsed="1"/>
+    <w:lsdException w:name="Table Grid 6" w:semiHidden="1" w:unhideWhenUsed="1"/>
+    <w:lsdException w:name="Table Grid 7" w:semiHidden="1" w:unhideWhenUsed="1"/>
+    <w:lsdException w:name="Table Grid 8" w:semiHidden="1" w:unhideWhenUsed="1"/>
+    <w:lsdException w:name="Table List 1" w:semiHidden="1" w:unhideWhenUsed="1"/>
+    <w:lsdException w:name="Table List 2" w:semiHidden="1" w:unhideWhenUsed="1"/>
+    <w:lsdException w:name="Table List 3" w:semiHidden="1" w:unhideWhenUsed="1"/>
+    <w:lsdException w:name="Table List 4" w:semiHidden="1" w:unhideWhenUsed="1"/>
+    <w:lsdException w:name="Table List 5" w:semiHidden="1" w:unhideWhenUsed="1"/>
+    <w:lsdException w:name="Table List 6" w:semiHidden="1" w:unhideWhenUsed="1"/>
+    <w:lsdException w:name="Table List 7" w:semiHidden="1" w:unhideWhenUsed="1"/>
+    <w:lsdException w:name="Table List 8" w:semiHidden="1" w:unhideWhenUsed="1"/>
+    <w:lsdException w:name="Table 3D effects 1" w:semiHidden="1" w:unhideWhenUsed="1"/>
+    <w:lsdException w:name="Table 3D effects 2" w:semiHidden="1" w:unhideWhenUsed="1"/>
+    <w:lsdException w:name="Table 3D effects 3" w:semiHidden="1" w:unhideWhenUsed="1"/>
+    <w:lsdException w:name="Table Contemporary" w:semiHidden="1" w:unhideWhenUsed="1"/>
+    <w:lsdException w:name="Table Elegant" w:semiHidden="1" w:unhideWhenUsed="1"/>
+    <w:lsdException w:name="Table Professional" w:semiHidden="1" w:unhideWhenUsed="1"/>
+    <w:lsdException w:name="Table Subtle 1" w:semiHidden="1" w:unhideWhenUsed="1"/>
+    <w:lsdException w:name="Table Subtle 2" w:semiHidden="1" w:unhideWhenUsed="1"/>
+    <w:lsdException w:name="Table Web 1" w:semiHidden="1" w:unhideWhenUsed="1"/>
+    <w:lsdException w:name="Table Web 2" w:semiHidden="1" w:unhideWhenUsed="1"/>
+    <w:lsdException w:name="Table Web 3" w:semiHidden="1" w:unhideWhenUsed="1"/>
+    <w:lsdException w:name="Table Theme" w:semiHidden="1" w:unhideWhenUsed="1"/>
     <w:lsdException w:name="Placeholder Text" w:semiHidden="1" w:uiPriority="99"/>
     <w:lsdException w:name="No Spacing" w:uiPriority="1" w:qFormat="1"/>
     <w:lsdException w:name="Light Shading" w:uiPriority="60"/>
@@ -2100,11 +2115,15 @@
   </w:style>
   <w:style w:type="character" w:default="1" w:styleId="DefaultParagraphFont">
     <w:name w:val="Default Paragraph Font"/>
+    <w:uiPriority w:val="1"/>
     <w:semiHidden/>
+    <w:unhideWhenUsed/>
   </w:style>
   <w:style w:type="table" w:default="1" w:styleId="TableNormal">
     <w:name w:val="Normal Table"/>
+    <w:uiPriority w:val="99"/>
     <w:semiHidden/>
+    <w:unhideWhenUsed/>
     <w:tblPr>
       <w:tblInd w:w="0" w:type="dxa"/>
       <w:tblCellMar>
@@ -2117,7 +2136,9 @@
   </w:style>
   <w:style w:type="numbering" w:default="1" w:styleId="NoList">
     <w:name w:val="No List"/>
+    <w:uiPriority w:val="99"/>
     <w:semiHidden/>
+    <w:unhideWhenUsed/>
   </w:style>
   <w:style w:type="character" w:styleId="FootnoteReference">
     <w:name w:val="footnote reference"/>

</xml_diff>